<commit_message>
new file:   SQL_MIGRATIN copy.sql 	new file:   SQL_MIGRATIN.sql 	modified:   activity_log.txt 	modified:   certificate_manager.db 	modified:   "certificates/year - Temp - Ar - D - SBS - \330\247\330\257\331\212\330\247\331\206 \330\271\330\250\330\257\330\247\331\204\330\247\331\205\331\212\330\261 \331\201\330\256\330\261\331\212 \330\247\330\255\331\205\330\257.docx" 	modified:   certificates/year - Temp - En - D - SBS - Adian Abdulameer Fakhri Al-Asadi.docx 	modified:   data/queries.py 	modified:   db.py 	modified:   localhost_new.sql 	modified:   screens/certificate_screen.py 	modified:   screens/students_screen.py 	new file:   sss.sql 	modified:   system_log.txt 	modified:   tools/migrate_mysql.py
</commit_message>
<xml_diff>
--- a/certificates/year - Temp - Ar - D - SBS - اديان عبدالامير فخري احمد.docx
+++ b/certificates/year - Temp - Ar - D - SBS - اديان عبدالامير فخري احمد.docx
@@ -6122,7 +6122,7 @@
                 <w:bCs/>
                 <w:lang w:bidi="ar-IQ"/>
               </w:rPr>
-              <w:t xml:space="preserve"> نغم باسل محمود</w:t>
+              <w:t xml:space="preserve">الأستاذ الدكتور رائدة سالم خضير</w:t>
             </w:r>
           </w:p>
           <w:p>
@@ -6140,7 +6140,7 @@
                 <w:rtl/>
                 <w:lang w:bidi="ar-IQ"/>
               </w:rPr>
-              <w:t xml:space="preserve">منظم الوثيقة</w:t>
+              <w:t xml:space="preserve">معاون العميد للشوون العلمية والدراسات العليا</w:t>
             </w:r>
           </w:p>
         </w:tc>
@@ -6290,7 +6290,7 @@
                 <w:bCs/>
                 <w:lang w:bidi="ar-IQ"/>
               </w:rPr>
-              <w:t xml:space="preserve"> </w:t>
+              <w:t xml:space="preserve">الأستاذ المساعد حيدر خزعل محبس</w:t>
             </w:r>
           </w:p>
           <w:p>
@@ -6308,7 +6308,7 @@
                 <w:rtl/>
                 <w:lang w:bidi="ar-IQ"/>
               </w:rPr>
-              <w:t xml:space="preserve"/>
+              <w:t xml:space="preserve">مساعد رئيس الجامعة للشؤون العلمية</w:t>
             </w:r>
           </w:p>
         </w:tc>
@@ -6380,7 +6380,7 @@
                 <w:bCs/>
                 <w:lang w:bidi="ar-IQ"/>
               </w:rPr>
-              <w:t xml:space="preserve"> </w:t>
+              <w:t xml:space="preserve">الأستاذ الدكتور هشام كاظم هاشم</w:t>
             </w:r>
           </w:p>
           <w:p>
@@ -6398,7 +6398,7 @@
                 <w:rtl/>
                 <w:lang w:bidi="ar-IQ"/>
               </w:rPr>
-              <w:t xml:space="preserve"/>
+              <w:t xml:space="preserve">العميد</w:t>
             </w:r>
           </w:p>
         </w:tc>
@@ -6512,7 +6512,7 @@
                 <w:bCs/>
                 <w:lang w:bidi="ar-IQ"/>
               </w:rPr>
-              <w:t xml:space="preserve">الأستاذ الدكتور رائدة سالم خضير</w:t>
+              <w:t xml:space="preserve"> أسراء فاضل عبد</w:t>
             </w:r>
           </w:p>
           <w:p>
@@ -6528,7 +6528,7 @@
                 <w:rtl/>
                 <w:lang w:bidi="ar-IQ"/>
               </w:rPr>
-              <w:t xml:space="preserve">معاون العميد للشوون العلمية والدراسات العليا</w:t>
+              <w:t xml:space="preserve">مسؤول وحدة الوثائق</w:t>
             </w:r>
           </w:p>
         </w:tc>
@@ -6554,7 +6554,7 @@
                 <w:bCs/>
                 <w:lang w:bidi="ar-IQ"/>
               </w:rPr>
-              <w:t xml:space="preserve"> أسراء فاضل عبد</w:t>
+              <w:t xml:space="preserve"> نغم باسل محمود</w:t>
             </w:r>
           </w:p>
           <w:p>
@@ -6571,7 +6571,7 @@
                 <w:rtl/>
                 <w:lang w:bidi="ar-IQ"/>
               </w:rPr>
-              <w:t xml:space="preserve">مسؤول وحدة الوثائق</w:t>
+              <w:t xml:space="preserve">منظم الوثيقة</w:t>
             </w:r>
           </w:p>
         </w:tc>

</xml_diff>